<commit_message>
feat: add 100% Attendance Award (Academic Year 2024-2025) with ceremony photo across portfolio, resume, and docs
</commit_message>
<xml_diff>
--- a/FRONTEND_DESIGN_AND_TESTING_LAB_PORTFOLIO_24MIC7312.docx
+++ b/FRONTEND_DESIGN_AND_TESTING_LAB_PORTFOLIO_24MIC7312.docx
@@ -405,6 +405,8 @@
           <w:color w:val="1E293B"/>
           <w:sz w:val="16"/>
         </w:rPr>
+        <w:t xml:space="preserve">  image?: string;</w:t>
+        <w:br/>
         <w:t>}</w:t>
         <w:br/>
         <w:br/>
@@ -1135,11 +1137,31 @@
         <w:br/>
         <w:t xml:space="preserve">    {</w:t>
         <w:br/>
+        <w:t xml:space="preserve">      title: '100% Attendance Award (Academic Year 2024–2025)',</w:t>
+        <w:br/>
+        <w:t xml:space="preserve">      badge: 'University Honor',</w:t>
+        <w:br/>
+        <w:t xml:space="preserve">      badgeClass: 'bg-warning-subtle text-warning border border-warning-subtle',</w:t>
+        <w:br/>
+        <w:t xml:space="preserve">      icon: 'bi-award-fill',</w:t>
+        <w:br/>
+        <w:t xml:space="preserve">      iconBoxStyle: 'color: #f59e0b; border-color: rgba(245,158,11,0.4); background: rgba(245,158,11,0.15);',</w:t>
+        <w:br/>
+        <w:t xml:space="preserve">      description: 'Conferred the prestigious 100% Attendance Award for the academic year 2024–2025 by VIT-AP University during the 8th University Day Celebrations, recognizing exceptional consistency, discipline, and commitment to academic excellence.',</w:t>
+        <w:br/>
+        <w:t xml:space="preserve">      tags: ['100% Attendance', 'VIT-AP University', 'Academic Excellence', 'Discipline &amp; Consistency'],</w:t>
+        <w:br/>
+        <w:t xml:space="preserve">      image: 'assets/award-attendance.jpg'</w:t>
+        <w:br/>
+        <w:t xml:space="preserve">    },</w:t>
+        <w:br/>
+        <w:t xml:space="preserve">    {</w:t>
+        <w:br/>
         <w:t xml:space="preserve">      title: 'Smart India Hackathon (SIH)',</w:t>
         <w:br/>
         <w:t xml:space="preserve">      badge: 'National Hackathon',</w:t>
         <w:br/>
-        <w:t xml:space="preserve">      badgeClass: 'bg-warning-subtle text-warning border border-warning-subtle',</w:t>
+        <w:t xml:space="preserve">      badgeClass: 'bg-primary-subtle text-primary border border-primary-subtle',</w:t>
         <w:br/>
         <w:t xml:space="preserve">      icon: 'bi-trophy-fill',</w:t>
         <w:br/>
@@ -1201,26 +1223,6 @@
         <w:t xml:space="preserve">      icon: 'bi-filetype-py',</w:t>
         <w:br/>
         <w:t xml:space="preserve">      description: 'Advanced Python paradigms, computational complexity analysis, data structures, and algorithmic implementation.'</w:t>
-        <w:br/>
-        <w:t xml:space="preserve">    },</w:t>
-        <w:br/>
-        <w:t xml:space="preserve">    {</w:t>
-        <w:br/>
-        <w:t xml:space="preserve">      title: 'Database Management &amp; SQL Specialist',</w:t>
-        <w:br/>
-        <w:t xml:space="preserve">      issuer: 'Relational Database Program',</w:t>
-        <w:br/>
-        <w:t xml:space="preserve">      badge: 'Database',</w:t>
-        <w:br/>
-        <w:t xml:space="preserve">      badgeClass: 'bg-success-subtle text-success border border-success-subtle',</w:t>
-        <w:br/>
-        <w:t xml:space="preserve">      icon: 'bi-database-check',</w:t>
-        <w:br/>
-        <w:t xml:space="preserve">      description: 'Comprehensive schema design, SQL querying, transactional integrity (ACID), normalization, and database indexing.'</w:t>
-        <w:br/>
-        <w:t xml:space="preserve">    }</w:t>
-        <w:br/>
-        <w:t xml:space="preserve">  ];</w:t>
       </w:r>
     </w:p>
     <w:p>
@@ -1233,6 +1235,26 @@
           <w:color w:val="1E293B"/>
           <w:sz w:val="16"/>
         </w:rPr>
+        <w:t xml:space="preserve">    },</w:t>
+        <w:br/>
+        <w:t xml:space="preserve">    {</w:t>
+        <w:br/>
+        <w:t xml:space="preserve">      title: 'Database Management &amp; SQL Specialist',</w:t>
+        <w:br/>
+        <w:t xml:space="preserve">      issuer: 'Relational Database Program',</w:t>
+        <w:br/>
+        <w:t xml:space="preserve">      badge: 'Database',</w:t>
+        <w:br/>
+        <w:t xml:space="preserve">      badgeClass: 'bg-success-subtle text-success border border-success-subtle',</w:t>
+        <w:br/>
+        <w:t xml:space="preserve">      icon: 'bi-database-check',</w:t>
+        <w:br/>
+        <w:t xml:space="preserve">      description: 'Comprehensive schema design, SQL querying, transactional integrity (ACID), normalization, and database indexing.'</w:t>
+        <w:br/>
+        <w:t xml:space="preserve">    }</w:t>
+        <w:br/>
+        <w:t xml:space="preserve">  ];</w:t>
+        <w:br/>
         <w:br/>
         <w:t xml:space="preserve">  openProjectModal(project: Project): void {</w:t>
         <w:br/>

</xml_diff>

<commit_message>
docs: update Word document lab report with 8 Angular modules, 100% attendance award, and website section screenshots
</commit_message>
<xml_diff>
--- a/FRONTEND_DESIGN_AND_TESTING_LAB_PORTFOLIO_24MIC7312.docx
+++ b/FRONTEND_DESIGN_AND_TESTING_LAB_PORTFOLIO_24MIC7312.docx
@@ -74,7 +74,7 @@
           <w:color w:val="475569"/>
           <w:sz w:val="19"/>
         </w:rPr>
-        <w:t>7 core Angular &amp; TypeScript production source modules are included in this complete assignment submission:</w:t>
+        <w:t>8 core Angular &amp; TypeScript production source modules are included in this complete assignment submission:</w:t>
       </w:r>
     </w:p>
     <w:p>
@@ -97,7 +97,7 @@
           <w:color w:val="475569"/>
           <w:sz w:val="18"/>
         </w:rPr>
-        <w:t>— TypeScript interfaces for Projects, Skills, Education, Certifications, and Social Profiles</w:t>
+        <w:t>— TypeScript interfaces for Projects, Skills, Education, Certifications, Achievements, and Social Profiles</w:t>
       </w:r>
     </w:p>
     <w:p>
@@ -120,7 +120,7 @@
           <w:color w:val="475569"/>
           <w:sz w:val="18"/>
         </w:rPr>
-        <w:t>— Angular Injectable state service with 4 featured projects (including 2 ECS projects) and credentials</w:t>
+        <w:t>— Angular Injectable state service with 4 featured projects (including 2 ECS projects), 100% Attendance Award, and credentials</w:t>
       </w:r>
     </w:p>
     <w:p>
@@ -135,7 +135,7 @@
           <w:color w:val="2563EB"/>
           <w:sz w:val="19"/>
         </w:rPr>
-        <w:t xml:space="preserve">src/app/services/theme.service.ts </w:t>
+        <w:t xml:space="preserve">src/app/components/skills/skills.component.ts </w:t>
       </w:r>
       <w:r>
         <w:rPr>
@@ -143,7 +143,7 @@
           <w:color w:val="475569"/>
           <w:sz w:val="18"/>
         </w:rPr>
-        <w:t>— Angular reactive theme switching service with localStorage persistence and signal-based state</w:t>
+        <w:t>— Angular component rendering skill matrix, progress bars, and Embedded Systems &amp; IoT (ECS) category</w:t>
       </w:r>
     </w:p>
     <w:p>
@@ -181,7 +181,7 @@
           <w:color w:val="2563EB"/>
           <w:sz w:val="19"/>
         </w:rPr>
-        <w:t xml:space="preserve">src/app/components/skills/skills.component.ts </w:t>
+        <w:t xml:space="preserve">src/app/components/achievements/achievements.component.ts </w:t>
       </w:r>
       <w:r>
         <w:rPr>
@@ -189,7 +189,30 @@
           <w:color w:val="475569"/>
           <w:sz w:val="18"/>
         </w:rPr>
-        <w:t>— Angular component rendering skill matrix, progress bars, and Embedded Systems &amp; IoT (ECS) category</w:t>
+        <w:t>— Angular component rendering 100% Attendance Award (2024–2025) with ceremony photo, Hackathons, and Certifications</w:t>
+      </w:r>
+    </w:p>
+    <w:p>
+      <w:pPr>
+        <w:pStyle w:val="ListBullet"/>
+        <w:spacing w:before="0" w:after="60"/>
+      </w:pPr>
+      <w:r>
+        <w:rPr>
+          <w:rFonts w:ascii="Consolas" w:hAnsi="Consolas"/>
+          <w:b/>
+          <w:color w:val="2563EB"/>
+          <w:sz w:val="19"/>
+        </w:rPr>
+        <w:t xml:space="preserve">src/app/components/contact/contact.component.ts </w:t>
+      </w:r>
+      <w:r>
+        <w:rPr>
+          <w:rFonts w:ascii="Arial" w:hAnsi="Arial"/>
+          <w:color w:val="475569"/>
+          <w:sz w:val="18"/>
+        </w:rPr>
+        <w:t>— Angular component providing interactive contact form with validation, social handles, and direct connectivity</w:t>
       </w:r>
     </w:p>
     <w:p>
@@ -516,7 +539,7 @@
           <w:color w:val="64748B"/>
           <w:sz w:val="17"/>
         </w:rPr>
-        <w:t>Figure 1.1: Angular application Home hero section displaying brand navbar, developer headline, tech halo avatar, and primary action buttons.</w:t>
+        <w:t>Figure 1.1: Angular application Home hero section displaying brand navbar, developer headline, 100% Attendance Award chip, tech halo avatar, and primary action buttons.</w:t>
       </w:r>
     </w:p>
     <w:p>
@@ -1303,7 +1326,7 @@
       <w:r>
         <w:drawing>
           <wp:inline xmlns:a="http://schemas.openxmlformats.org/drawingml/2006/main" xmlns:pic="http://schemas.openxmlformats.org/drawingml/2006/picture">
-            <wp:extent cx="5669280" cy="2908494"/>
+            <wp:extent cx="5669280" cy="2913865"/>
             <wp:docPr id="2" name="Picture 2"/>
             <wp:cNvGraphicFramePr>
               <a:graphicFrameLocks noChangeAspect="1"/>
@@ -1324,7 +1347,7 @@
                   <pic:spPr>
                     <a:xfrm>
                       <a:off x="0" y="0"/>
-                      <a:ext cx="5669280" cy="2908494"/>
+                      <a:ext cx="5669280" cy="2913865"/>
                     </a:xfrm>
                     <a:prstGeom prst="rect"/>
                   </pic:spPr>
@@ -1347,7 +1370,7 @@
           <w:color w:val="64748B"/>
           <w:sz w:val="17"/>
         </w:rPr>
-        <w:t>Figure 2.1: Angular application About section showcasing personal narrative, verified academic scores (9.68 CGPA, 982/1000 Intermediate, 589/600 SSC), and profile portrait.</w:t>
+        <w:t>Figure 2.1: Angular application About section showcasing personal narrative, verified academic scores (9.68 CGPA, 982/1000 Intermediate, 589/600 SSC), 100% Attendance Award, and profile portrait.</w:t>
       </w:r>
     </w:p>
     <w:p>
@@ -1367,7 +1390,7 @@
           <w:color w:val="0F172A"/>
           <w:sz w:val="26"/>
         </w:rPr>
-        <w:t>3. Angular Reactive Theme Switching Service</w:t>
+        <w:t>3. Angular Skills Component &amp; Embedded Systems (ECS) Matrix</w:t>
       </w:r>
     </w:p>
     <w:p>
@@ -1382,7 +1405,7 @@
           <w:color w:val="2563EB"/>
           <w:sz w:val="20"/>
         </w:rPr>
-        <w:t>src/app/services/theme.service.ts</w:t>
+        <w:t>src/app/components/skills/skills.component.ts</w:t>
       </w:r>
     </w:p>
     <w:p>
@@ -1410,73 +1433,235 @@
           <w:color w:val="1E293B"/>
           <w:sz w:val="16"/>
         </w:rPr>
-        <w:t>import { Injectable, signal } from '@angular/core';</w:t>
-        <w:br/>
-        <w:br/>
-        <w:t>export type ThemeMode = 'dark' | 'light';</w:t>
-        <w:br/>
-        <w:br/>
-        <w:t>@Injectable({</w:t>
-        <w:br/>
-        <w:t xml:space="preserve">  providedIn: 'root'</w:t>
+        <w:t>import { Component, inject } from '@angular/core';</w:t>
+        <w:br/>
+        <w:t>import { CommonModule } from '@angular/common';</w:t>
+        <w:br/>
+        <w:t>import { PortfolioService } from '../../services/portfolio.service';</w:t>
+        <w:br/>
+        <w:br/>
+        <w:t>@Component({</w:t>
+        <w:br/>
+        <w:t xml:space="preserve">  selector: 'app-skills',</w:t>
+        <w:br/>
+        <w:t xml:space="preserve">  standalone: true,</w:t>
+        <w:br/>
+        <w:t xml:space="preserve">  imports: [CommonModule],</w:t>
+        <w:br/>
+        <w:t xml:space="preserve">  template: `</w:t>
+        <w:br/>
+        <w:t xml:space="preserve">    &lt;section id="skills" class="section-padding" aria-label="Skills Section"&gt;</w:t>
+        <w:br/>
+        <w:t xml:space="preserve">      &lt;div class="container"&gt;</w:t>
+        <w:br/>
+        <w:t xml:space="preserve">        &lt;!-- Section Header --&gt;</w:t>
+        <w:br/>
+        <w:t xml:space="preserve">        &lt;div class="section-header"&gt;</w:t>
+        <w:br/>
+        <w:t xml:space="preserve">          &lt;span class="section-badge"&gt;&lt;i class="bi bi-cpu-fill"&gt;&lt;/i&gt; Technical Expertise&lt;/span&gt;</w:t>
+        <w:br/>
+        <w:t xml:space="preserve">          &lt;h2 class="section-title"&gt;Skills &amp;amp; &lt;span class="gradient-text"&gt;Proficiencies&lt;/span&gt;&lt;/h2&gt;</w:t>
+        <w:br/>
+        <w:t xml:space="preserve">          &lt;p class="section-subtitle"&gt;</w:t>
+        <w:br/>
+        <w:t xml:space="preserve">            Comprehensive skill matrix covering programming languages, frontend frameworks, backend architectures, embedded IoT systems, and professional soft skills.</w:t>
+        <w:br/>
+        <w:t xml:space="preserve">          &lt;/p&gt;</w:t>
+        <w:br/>
+        <w:t xml:space="preserve">        &lt;/div&gt;</w:t>
+        <w:br/>
+        <w:br/>
+        <w:t xml:space="preserve">        &lt;div class="row g-4"&gt;</w:t>
+        <w:br/>
+        <w:t xml:space="preserve">          &lt;!-- 3 Primary Technical Categories --&gt;</w:t>
+        <w:br/>
+        <w:t xml:space="preserve">          @for (cat of portfolio.skillCategories; track cat.title) {</w:t>
+        <w:br/>
+        <w:t xml:space="preserve">            &lt;div class="col-lg-4 col-md-6"&gt;</w:t>
+        <w:br/>
+        <w:t xml:space="preserve">              &lt;div class="glass-card skill-card"&gt;</w:t>
+        <w:br/>
+        <w:t xml:space="preserve">                &lt;div class="skill-category-header"&gt;</w:t>
+        <w:br/>
+        <w:t xml:space="preserve">                  &lt;div class="skill-cat-icon"&gt;</w:t>
+        <w:br/>
+        <w:t xml:space="preserve">                    &lt;i class="bi" [ngClass]="cat.icon"&gt;&lt;/i&gt;</w:t>
+        <w:br/>
+        <w:t xml:space="preserve">                  &lt;/div&gt;</w:t>
+        <w:br/>
+        <w:t xml:space="preserve">                  &lt;div&gt;</w:t>
+        <w:br/>
+        <w:t xml:space="preserve">                    &lt;h3 class="h5 mb-0"&gt;{{ cat.title }}&lt;/h3&gt;</w:t>
+        <w:br/>
+        <w:t xml:space="preserve">                    &lt;span class="text-muted small"&gt;{{ cat.subtitle }}&lt;/span&gt;</w:t>
+        <w:br/>
+        <w:t xml:space="preserve">                  &lt;/div&gt;</w:t>
+        <w:br/>
+        <w:t xml:space="preserve">                &lt;/div&gt;</w:t>
+        <w:br/>
+        <w:br/>
+        <w:t xml:space="preserve">                @for (item of cat.items; track item.name) {</w:t>
+        <w:br/>
+        <w:t xml:space="preserve">                  &lt;div class="skill-item"&gt;</w:t>
+        <w:br/>
+        <w:t xml:space="preserve">                    &lt;div class="skill-item-header"&gt;</w:t>
+        <w:br/>
+        <w:t xml:space="preserve">                      &lt;span class="skill-name"&gt;</w:t>
+        <w:br/>
+        <w:t xml:space="preserve">                        &lt;i class="bi" [ngClass]="[item.icon, item.iconColor]"&gt;&lt;/i&gt; {{ item.name }}</w:t>
+        <w:br/>
+        <w:t xml:space="preserve">                      &lt;/span&gt;</w:t>
+        <w:br/>
+        <w:t xml:space="preserve">                      &lt;span class="skill-status-tag" [ngClass]="item.statusClass"&gt;{{ item.status }}&lt;/span&gt;</w:t>
+        <w:br/>
+        <w:t xml:space="preserve">                    &lt;/div&gt;</w:t>
+        <w:br/>
+        <w:t xml:space="preserve">                    &lt;div class="custom-progress"&gt;</w:t>
+        <w:br/>
+        <w:t xml:space="preserve">                      &lt;div class="progress-bar" [ngClass]="item.progressBarClass || ''" [style.width.%]="item.percentage"&gt;&lt;/div&gt;</w:t>
+        <w:br/>
+        <w:t xml:space="preserve">                    &lt;/div&gt;</w:t>
+        <w:br/>
+        <w:t xml:space="preserve">                  &lt;/div&gt;</w:t>
+        <w:br/>
+        <w:t xml:space="preserve">                }</w:t>
+        <w:br/>
+        <w:t xml:space="preserve">              &lt;/div&gt;</w:t>
+        <w:br/>
+        <w:t xml:space="preserve">            &lt;/div&gt;</w:t>
+      </w:r>
+    </w:p>
+    <w:p>
+      <w:pPr>
+        <w:spacing w:before="0" w:after="0" w:line="252" w:lineRule="auto"/>
+      </w:pPr>
+      <w:r>
+        <w:rPr>
+          <w:rFonts w:ascii="Consolas" w:hAnsi="Consolas"/>
+          <w:color w:val="1E293B"/>
+          <w:sz w:val="16"/>
+        </w:rPr>
+        <w:t xml:space="preserve">          }</w:t>
+        <w:br/>
+        <w:br/>
+        <w:t xml:space="preserve">          &lt;!-- 4. Embedded Systems &amp; IoT (ECS) Section --&gt;</w:t>
+        <w:br/>
+        <w:t xml:space="preserve">          &lt;div class="col-12"&gt;</w:t>
+        <w:br/>
+        <w:t xml:space="preserve">            &lt;div class="glass-card p-4"&gt;</w:t>
+        <w:br/>
+        <w:t xml:space="preserve">              &lt;div class="skill-category-header mb-3"&gt;</w:t>
+        <w:br/>
+        <w:t xml:space="preserve">                &lt;div class="skill-cat-icon"&gt;</w:t>
+        <w:br/>
+        <w:t xml:space="preserve">                  &lt;i class="bi bi-cpu-fill"&gt;&lt;/i&gt;</w:t>
+        <w:br/>
+        <w:t xml:space="preserve">                &lt;/div&gt;</w:t>
+        <w:br/>
+        <w:t xml:space="preserve">                &lt;div&gt;</w:t>
+        <w:br/>
+        <w:t xml:space="preserve">                  &lt;h3 class="h5 mb-0"&gt;Embedded Systems &amp;amp; IoT (ECS)&lt;/h3&gt;</w:t>
+        <w:br/>
+        <w:t xml:space="preserve">                  &lt;span class="text-muted small"&gt;Hardware-Software Integration &amp;amp; Sensor Systems&lt;/span&gt;</w:t>
+        <w:br/>
+        <w:t xml:space="preserve">                &lt;/div&gt;</w:t>
+        <w:br/>
+        <w:t xml:space="preserve">              &lt;/div&gt;</w:t>
+        <w:br/>
+        <w:t xml:space="preserve">              &lt;div class="row g-3"&gt;</w:t>
+        <w:br/>
+        <w:t xml:space="preserve">                @for (skill of portfolio.ecsSkills; track skill.name) {</w:t>
+        <w:br/>
+        <w:t xml:space="preserve">                  &lt;div class="col-md-4 col-sm-6"&gt;</w:t>
+        <w:br/>
+        <w:t xml:space="preserve">                    &lt;div class="skill-item mb-0"&gt;</w:t>
+        <w:br/>
+        <w:t xml:space="preserve">                      &lt;div class="skill-item-header"&gt;</w:t>
+        <w:br/>
+        <w:t xml:space="preserve">                        &lt;span class="skill-name"&gt;</w:t>
+        <w:br/>
+        <w:t xml:space="preserve">                          &lt;i class="bi" [ngClass]="[skill.icon, skill.iconColor]"&gt;&lt;/i&gt; {{ skill.name }}</w:t>
+        <w:br/>
+        <w:t xml:space="preserve">                        &lt;/span&gt;</w:t>
+        <w:br/>
+        <w:t xml:space="preserve">                        &lt;span class="skill-status-tag" [ngClass]="skill.statusClass"&gt;{{ skill.status }}&lt;/span&gt;</w:t>
+        <w:br/>
+        <w:t xml:space="preserve">                      &lt;/div&gt;</w:t>
+        <w:br/>
+        <w:t xml:space="preserve">                      &lt;div class="custom-progress"&gt;</w:t>
+        <w:br/>
+        <w:t xml:space="preserve">                        &lt;div class="progress-bar" [ngClass]="skill.progressBarClass || ''" [style.width.%]="skill.percentage"&gt;&lt;/div&gt;</w:t>
+        <w:br/>
+        <w:t xml:space="preserve">                      &lt;/div&gt;</w:t>
+        <w:br/>
+        <w:t xml:space="preserve">                    &lt;/div&gt;</w:t>
+        <w:br/>
+        <w:t xml:space="preserve">                  &lt;/div&gt;</w:t>
+        <w:br/>
+        <w:t xml:space="preserve">                }</w:t>
+        <w:br/>
+        <w:t xml:space="preserve">              &lt;/div&gt;</w:t>
+        <w:br/>
+        <w:t xml:space="preserve">            &lt;/div&gt;</w:t>
+        <w:br/>
+        <w:t xml:space="preserve">          &lt;/div&gt;</w:t>
+        <w:br/>
+        <w:br/>
+        <w:t xml:space="preserve">          &lt;!-- 5. Soft Skills Highlight Section --&gt;</w:t>
+        <w:br/>
+        <w:t xml:space="preserve">          &lt;div class="col-12"&gt;</w:t>
+        <w:br/>
+        <w:t xml:space="preserve">            &lt;div class="glass-card p-4"&gt;</w:t>
+        <w:br/>
+        <w:t xml:space="preserve">              &lt;h3 class="h5 mb-3 d-flex align-items-center gap-2"&gt;</w:t>
+        <w:br/>
+        <w:t xml:space="preserve">                &lt;i class="bi bi-people-fill text-info"&gt;&lt;/i&gt; Key Soft Skills &amp;amp; Professional Attributes</w:t>
+        <w:br/>
+        <w:t xml:space="preserve">              &lt;/h3&gt;</w:t>
+        <w:br/>
+        <w:t xml:space="preserve">              &lt;div class="d-flex flex-wrap gap-3"&gt;</w:t>
+        <w:br/>
+        <w:t xml:space="preserve">                @for (soft of portfolio.softSkills; track soft.name) {</w:t>
+        <w:br/>
+        <w:t xml:space="preserve">                  &lt;div class="soft-skill-chip"&gt;</w:t>
+        <w:br/>
+        <w:t xml:space="preserve">                    &lt;i class="bi" [ngClass]="[soft.icon, soft.colorClass]"&gt;&lt;/i&gt; {{ soft.name }}</w:t>
+        <w:br/>
+        <w:t xml:space="preserve">                  &lt;/div&gt;</w:t>
+        <w:br/>
+        <w:t xml:space="preserve">                }</w:t>
+        <w:br/>
+        <w:t xml:space="preserve">              &lt;/div&gt;</w:t>
+        <w:br/>
+        <w:t xml:space="preserve">            &lt;/div&gt;</w:t>
+        <w:br/>
+        <w:t xml:space="preserve">          &lt;/div&gt;</w:t>
+        <w:br/>
+      </w:r>
+    </w:p>
+    <w:p>
+      <w:pPr>
+        <w:spacing w:before="0" w:after="0" w:line="252" w:lineRule="auto"/>
+      </w:pPr>
+      <w:r>
+        <w:rPr>
+          <w:rFonts w:ascii="Consolas" w:hAnsi="Consolas"/>
+          <w:color w:val="1E293B"/>
+          <w:sz w:val="16"/>
+        </w:rPr>
+        <w:t xml:space="preserve">        &lt;/div&gt;</w:t>
+        <w:br/>
+        <w:t xml:space="preserve">      &lt;/div&gt;</w:t>
+        <w:br/>
+        <w:t xml:space="preserve">    &lt;/section&gt;</w:t>
+        <w:br/>
+        <w:t xml:space="preserve">  `</w:t>
         <w:br/>
         <w:t>})</w:t>
         <w:br/>
-        <w:t>export class ThemeService {</w:t>
-        <w:br/>
-        <w:t xml:space="preserve">  private readonly STORAGE_KEY = 'portfolio_theme_mode';</w:t>
-        <w:br/>
-        <w:t xml:space="preserve">  currentTheme = signal&lt;ThemeMode&gt;('dark');</w:t>
-        <w:br/>
-        <w:br/>
-        <w:t xml:space="preserve">  constructor() {</w:t>
-        <w:br/>
-        <w:t xml:space="preserve">    this.initTheme();</w:t>
-        <w:br/>
-        <w:t xml:space="preserve">  }</w:t>
-        <w:br/>
-        <w:br/>
-        <w:t xml:space="preserve">  private initTheme(): void {</w:t>
-        <w:br/>
-        <w:t xml:space="preserve">    if (typeof window !== 'undefined' &amp;&amp; window.localStorage) {</w:t>
-        <w:br/>
-        <w:t xml:space="preserve">      const saved = localStorage.getItem(this.STORAGE_KEY) as ThemeMode;</w:t>
-        <w:br/>
-        <w:t xml:space="preserve">      const initial = saved === 'light' || saved === 'dark' ? saved : 'dark';</w:t>
-        <w:br/>
-        <w:t xml:space="preserve">      this.setTheme(initial);</w:t>
-        <w:br/>
-        <w:t xml:space="preserve">    }</w:t>
-        <w:br/>
-        <w:t xml:space="preserve">  }</w:t>
-        <w:br/>
-        <w:br/>
-        <w:t xml:space="preserve">  setTheme(theme: ThemeMode): void {</w:t>
-        <w:br/>
-        <w:t xml:space="preserve">    this.currentTheme.set(theme);</w:t>
-        <w:br/>
-        <w:t xml:space="preserve">    if (typeof document !== 'undefined') {</w:t>
-        <w:br/>
-        <w:t xml:space="preserve">      document.documentElement.setAttribute('data-theme', theme);</w:t>
-        <w:br/>
-        <w:t xml:space="preserve">    }</w:t>
-        <w:br/>
-        <w:t xml:space="preserve">    if (typeof window !== 'undefined' &amp;&amp; window.localStorage) {</w:t>
-        <w:br/>
-        <w:t xml:space="preserve">      localStorage.setItem(this.STORAGE_KEY, theme);</w:t>
-        <w:br/>
-        <w:t xml:space="preserve">    }</w:t>
-        <w:br/>
-        <w:t xml:space="preserve">  }</w:t>
-        <w:br/>
-        <w:br/>
-        <w:t xml:space="preserve">  toggleTheme(): void {</w:t>
-        <w:br/>
-        <w:t xml:space="preserve">    const next = this.currentTheme() === 'dark' ? 'light' : 'dark';</w:t>
-        <w:br/>
-        <w:t xml:space="preserve">    this.setTheme(next);</w:t>
-        <w:br/>
-        <w:t xml:space="preserve">  }</w:t>
+        <w:t>export class SkillsComponent {</w:t>
+        <w:br/>
+        <w:t xml:space="preserve">  portfolio = inject(PortfolioService);</w:t>
         <w:br/>
         <w:t>}</w:t>
         <w:br/>
@@ -1848,7 +2033,7 @@
           <w:color w:val="0F172A"/>
           <w:sz w:val="26"/>
         </w:rPr>
-        <w:t>5. Angular Skills Component &amp; Progress Indicators</w:t>
+        <w:t>5. Angular Achievements &amp; Certifications Component</w:t>
       </w:r>
     </w:p>
     <w:p>
@@ -1863,7 +2048,7 @@
           <w:color w:val="2563EB"/>
           <w:sz w:val="20"/>
         </w:rPr>
-        <w:t>src/app/components/skills/skills.component.ts</w:t>
+        <w:t>src/app/components/achievements/achievements.component.ts</w:t>
       </w:r>
     </w:p>
     <w:p>
@@ -1900,7 +2085,7 @@
         <w:br/>
         <w:t>@Component({</w:t>
         <w:br/>
-        <w:t xml:space="preserve">  selector: 'app-skills',</w:t>
+        <w:t xml:space="preserve">  selector: 'app-achievements',</w:t>
         <w:br/>
         <w:t xml:space="preserve">  standalone: true,</w:t>
         <w:br/>
@@ -1908,7 +2093,7 @@
         <w:br/>
         <w:t xml:space="preserve">  template: `</w:t>
         <w:br/>
-        <w:t xml:space="preserve">    &lt;section id="skills" class="section-padding" aria-label="Skills Section"&gt;</w:t>
+        <w:t xml:space="preserve">    &lt;section id="achievements" class="section-padding" aria-label="Achievements and Certifications"&gt;</w:t>
         <w:br/>
         <w:t xml:space="preserve">      &lt;div class="container"&gt;</w:t>
         <w:br/>
@@ -1916,73 +2101,582 @@
         <w:br/>
         <w:t xml:space="preserve">        &lt;div class="section-header"&gt;</w:t>
         <w:br/>
-        <w:t xml:space="preserve">          &lt;span class="section-badge"&gt;&lt;i class="bi bi-cpu-fill"&gt;&lt;/i&gt; Technical Expertise&lt;/span&gt;</w:t>
-        <w:br/>
-        <w:t xml:space="preserve">          &lt;h2 class="section-title"&gt;Skills &amp;amp; &lt;span class="gradient-text"&gt;Proficiencies&lt;/span&gt;&lt;/h2&gt;</w:t>
+        <w:t xml:space="preserve">          &lt;span class="section-badge"&gt;&lt;i class="bi bi-award-fill"&gt;&lt;/i&gt; Milestones&lt;/span&gt;</w:t>
+        <w:br/>
+        <w:t xml:space="preserve">          &lt;h2 class="section-title"&gt;Achievements &amp;amp; &lt;span class="gradient-text"&gt;Certifications&lt;/span&gt;&lt;/h2&gt;</w:t>
         <w:br/>
         <w:t xml:space="preserve">          &lt;p class="section-subtitle"&gt;</w:t>
         <w:br/>
-        <w:t xml:space="preserve">            Comprehensive skill matrix covering programming languages, frontend frameworks, backend architectures, embedded IoT systems, and professional soft skills.</w:t>
+        <w:t xml:space="preserve">            Recognitions, academic honors from VIT-AP University, professional certifications including Hedera Hashgraph Blockchain, and competitive programming profiles.</w:t>
         <w:br/>
         <w:t xml:space="preserve">          &lt;/p&gt;</w:t>
         <w:br/>
         <w:t xml:space="preserve">        &lt;/div&gt;</w:t>
         <w:br/>
         <w:br/>
+        <w:t xml:space="preserve">        &lt;!-- 1. Major Honors &amp; Competitions --&gt;</w:t>
+        <w:br/>
+        <w:t xml:space="preserve">        &lt;h3 class="h4 mb-4 d-flex align-items-center gap-2"&gt;</w:t>
+        <w:br/>
+        <w:t xml:space="preserve">          &lt;i class="bi bi-trophy-fill text-warning"&gt;&lt;/i&gt; Honors, Awards &amp;amp; Hackathons</w:t>
+        <w:br/>
+        <w:t xml:space="preserve">        &lt;/h3&gt;</w:t>
+        <w:br/>
+        <w:br/>
+        <w:t xml:space="preserve">        &lt;div class="row g-4 mb-5"&gt;</w:t>
+        <w:br/>
+        <w:t xml:space="preserve">          @for (ach of portfolio.achievements; track ach.title) {</w:t>
+        <w:br/>
+        <w:t xml:space="preserve">            &lt;div [ngClass]="ach.image ? 'col-12' : 'col-lg-6'"&gt;</w:t>
+        <w:br/>
+        <w:t xml:space="preserve">              &lt;div class="glass-card achievement-card" [class.p-4]="ach.image"&gt;</w:t>
+        <w:br/>
+        <w:t xml:space="preserve">                @if (ach.image) {</w:t>
+        <w:br/>
+        <w:t xml:space="preserve">                  &lt;div class="row align-items-center g-4"&gt;</w:t>
+        <w:br/>
+        <w:t xml:space="preserve">                    &lt;div class="col-md-7"&gt;</w:t>
+        <w:br/>
+        <w:t xml:space="preserve">                      &lt;div class="d-flex justify-content-between align-items-start mb-2"&gt;</w:t>
+        <w:br/>
+        <w:t xml:space="preserve">                        &lt;div class="achievement-icon-box" [attr.style]="ach.iconBoxStyle || null"&gt;</w:t>
+        <w:br/>
+        <w:t xml:space="preserve">                          &lt;i class="bi" [ngClass]="ach.icon"&gt;&lt;/i&gt;</w:t>
+        <w:br/>
+        <w:t xml:space="preserve">                        &lt;/div&gt;</w:t>
+        <w:br/>
+        <w:t xml:space="preserve">                        &lt;span class="badge px-3 py-1" [ngClass]="ach.badgeClass"&gt;</w:t>
+        <w:br/>
+        <w:t xml:space="preserve">                          {{ ach.badge }}</w:t>
+        <w:br/>
+        <w:t xml:space="preserve">                        &lt;/span&gt;</w:t>
+        <w:br/>
+        <w:t xml:space="preserve">                      &lt;/div&gt;</w:t>
+        <w:br/>
+        <w:t xml:space="preserve">                      &lt;h4 class="h5 mb-2"&gt;{{ ach.title }}&lt;/h4&gt;</w:t>
+        <w:br/>
+        <w:t xml:space="preserve">                      &lt;p class="text-secondary small mb-3"&gt;{{ ach.description }}&lt;/p&gt;</w:t>
+        <w:br/>
+        <w:t xml:space="preserve">                      &lt;div class="d-flex flex-wrap gap-2"&gt;</w:t>
+        <w:br/>
+        <w:t xml:space="preserve">                        @for (t of ach.tags; track t) {</w:t>
+        <w:br/>
+        <w:t xml:space="preserve">                          &lt;span class="badge bg-black-subtle border border-secondary small"&gt;{{ t }}&lt;/span&gt;</w:t>
+        <w:br/>
+        <w:t xml:space="preserve">                        }</w:t>
+        <w:br/>
+        <w:t xml:space="preserve">                      &lt;/div&gt;</w:t>
+        <w:br/>
+        <w:t xml:space="preserve">                    &lt;/div&gt;</w:t>
+        <w:br/>
+        <w:t xml:space="preserve">                    &lt;div class="col-md-5"&gt;</w:t>
+        <w:br/>
+        <w:t xml:space="preserve">                      &lt;div class="rounded-3 overflow-hidden border border-secondary shadow-sm"&gt;</w:t>
+      </w:r>
+    </w:p>
+    <w:p>
+      <w:pPr>
+        <w:spacing w:before="0" w:after="0" w:line="252" w:lineRule="auto"/>
+      </w:pPr>
+      <w:r>
+        <w:rPr>
+          <w:rFonts w:ascii="Consolas" w:hAnsi="Consolas"/>
+          <w:color w:val="1E293B"/>
+          <w:sz w:val="16"/>
+        </w:rPr>
+        <w:t xml:space="preserve">                        &lt;img [src]="ach.image" [alt]="ach.title + ' at VIT-AP University Day'" class="img-fluid w-100" style="object-fit: cover; max-height: 250px;"&gt;</w:t>
+        <w:br/>
+        <w:t xml:space="preserve">                      &lt;/div&gt;</w:t>
+        <w:br/>
+        <w:t xml:space="preserve">                    &lt;/div&gt;</w:t>
+        <w:br/>
+        <w:t xml:space="preserve">                  &lt;/div&gt;</w:t>
+        <w:br/>
+        <w:t xml:space="preserve">                } @else {</w:t>
+        <w:br/>
+        <w:t xml:space="preserve">                  &lt;div class="d-flex justify-content-between align-items-start mb-2"&gt;</w:t>
+        <w:br/>
+        <w:t xml:space="preserve">                    &lt;div class="achievement-icon-box" [attr.style]="ach.iconBoxStyle || null"&gt;</w:t>
+        <w:br/>
+        <w:t xml:space="preserve">                      &lt;i class="bi" [ngClass]="ach.icon"&gt;&lt;/i&gt;</w:t>
+        <w:br/>
+        <w:t xml:space="preserve">                    &lt;/div&gt;</w:t>
+        <w:br/>
+        <w:t xml:space="preserve">                    &lt;span class="badge px-3 py-1" [ngClass]="ach.badgeClass"&gt;</w:t>
+        <w:br/>
+        <w:t xml:space="preserve">                      {{ ach.badge }}</w:t>
+        <w:br/>
+        <w:t xml:space="preserve">                    &lt;/span&gt;</w:t>
+        <w:br/>
+        <w:t xml:space="preserve">                  &lt;/div&gt;</w:t>
+        <w:br/>
+        <w:t xml:space="preserve">                  &lt;h4 class="h5 mb-2"&gt;{{ ach.title }}&lt;/h4&gt;</w:t>
+        <w:br/>
+        <w:t xml:space="preserve">                  &lt;p class="text-secondary small mb-3"&gt;{{ ach.description }}&lt;/p&gt;</w:t>
+        <w:br/>
+        <w:t xml:space="preserve">                  &lt;div class="d-flex flex-wrap gap-2"&gt;</w:t>
+        <w:br/>
+        <w:t xml:space="preserve">                    @for (t of ach.tags; track t) {</w:t>
+        <w:br/>
+        <w:t xml:space="preserve">                      &lt;span class="badge bg-black-subtle border border-secondary small"&gt;{{ t }}&lt;/span&gt;</w:t>
+        <w:br/>
+        <w:t xml:space="preserve">                    }</w:t>
+        <w:br/>
+        <w:t xml:space="preserve">                  &lt;/div&gt;</w:t>
+        <w:br/>
+        <w:t xml:space="preserve">                }</w:t>
+        <w:br/>
+        <w:t xml:space="preserve">              &lt;/div&gt;</w:t>
+        <w:br/>
+        <w:t xml:space="preserve">            &lt;/div&gt;</w:t>
+        <w:br/>
+        <w:t xml:space="preserve">          }</w:t>
+        <w:br/>
+        <w:t xml:space="preserve">        &lt;/div&gt;</w:t>
+        <w:br/>
+        <w:br/>
+        <w:t xml:space="preserve">        &lt;!-- 2. Certifications Grid --&gt;</w:t>
+        <w:br/>
+        <w:t xml:space="preserve">        &lt;h3 class="h4 mb-4 d-flex align-items-center gap-2"&gt;</w:t>
+        <w:br/>
+        <w:t xml:space="preserve">          &lt;i class="bi bi-patch-check-fill text-info"&gt;&lt;/i&gt; Professional Certifications</w:t>
+        <w:br/>
+        <w:t xml:space="preserve">        &lt;/h3&gt;</w:t>
+        <w:br/>
+        <w:br/>
+        <w:t xml:space="preserve">        &lt;div class="row g-4 mb-5"&gt;</w:t>
+        <w:br/>
+        <w:t xml:space="preserve">          @for (cert of portfolio.certifications; track cert.title) {</w:t>
+        <w:br/>
+        <w:t xml:space="preserve">            &lt;div class="col-lg-4 col-md-6"&gt;</w:t>
+        <w:br/>
+        <w:t xml:space="preserve">              &lt;div class="glass-card cert-card h-100"&gt;</w:t>
+        <w:br/>
+        <w:t xml:space="preserve">                &lt;div class="d-flex justify-content-between align-items-center mb-3"&gt;</w:t>
+        <w:br/>
+        <w:t xml:space="preserve">                  &lt;span class="badge px-2 py-1" [ngClass]="cert.badgeClass"&gt;</w:t>
+        <w:br/>
+        <w:t xml:space="preserve">                    &lt;i class="bi" [ngClass]="cert.icon" class="me-1"&gt;&lt;/i&gt; {{ cert.badge }}</w:t>
+        <w:br/>
+        <w:t xml:space="preserve">                  &lt;/span&gt;</w:t>
+        <w:br/>
+        <w:t xml:space="preserve">                  &lt;i class="bi bi-patch-check-fill text-info fs-5"&gt;&lt;/i&gt;</w:t>
+        <w:br/>
+        <w:t xml:space="preserve">                &lt;/div&gt;</w:t>
+        <w:br/>
+        <w:t xml:space="preserve">                &lt;h4 class="h6 mb-2"&gt;{{ cert.title }}&lt;/h4&gt;</w:t>
+        <w:br/>
+        <w:t xml:space="preserve">                &lt;div class="text-info small fw-bold mb-2"&gt;{{ cert.issuer }}&lt;/div&gt;</w:t>
+        <w:br/>
+        <w:t xml:space="preserve">                &lt;p class="text-secondary small mb-0"&gt;{{ cert.description }}&lt;/p&gt;</w:t>
+        <w:br/>
+        <w:t xml:space="preserve">              &lt;/div&gt;</w:t>
+        <w:br/>
+        <w:t xml:space="preserve">            &lt;/div&gt;</w:t>
+        <w:br/>
+        <w:t xml:space="preserve">          }</w:t>
+        <w:br/>
+        <w:t xml:space="preserve">        &lt;/div&gt;</w:t>
+        <w:br/>
+        <w:br/>
+        <w:t xml:space="preserve">        &lt;!-- 3. LeetCode &amp; Coding Profiles --&gt;</w:t>
+      </w:r>
+    </w:p>
+    <w:p>
+      <w:pPr>
+        <w:spacing w:before="0" w:after="0" w:line="252" w:lineRule="auto"/>
+      </w:pPr>
+      <w:r>
+        <w:rPr>
+          <w:rFonts w:ascii="Consolas" w:hAnsi="Consolas"/>
+          <w:color w:val="1E293B"/>
+          <w:sz w:val="16"/>
+        </w:rPr>
+        <w:t xml:space="preserve">        &lt;div class="glass-card p-4"&gt;</w:t>
+        <w:br/>
+        <w:t xml:space="preserve">          &lt;div class="d-flex justify-content-between align-items-center flex-wrap gap-3"&gt;</w:t>
+        <w:br/>
+        <w:t xml:space="preserve">            &lt;div&gt;</w:t>
+        <w:br/>
+        <w:t xml:space="preserve">              &lt;h4 class="h5 mb-1 d-flex align-items-center gap-2"&gt;</w:t>
+        <w:br/>
+        <w:t xml:space="preserve">                &lt;i class="bi bi-code-slash text-warning"&gt;&lt;/i&gt; Competitive Programming &amp;amp; Algorithmic Practice</w:t>
+        <w:br/>
+        <w:t xml:space="preserve">              &lt;/h4&gt;</w:t>
+        <w:br/>
+        <w:t xml:space="preserve">              &lt;p class="text-secondary small mb-0"&gt;</w:t>
+        <w:br/>
+        <w:t xml:space="preserve">                Active problem solver practicing data structures, dynamic programming, and graph algorithms on LeetCode.</w:t>
+        <w:br/>
+        <w:t xml:space="preserve">              &lt;/p&gt;</w:t>
+        <w:br/>
+        <w:t xml:space="preserve">            &lt;/div&gt;</w:t>
+        <w:br/>
+        <w:t xml:space="preserve">            &lt;div class="d-flex gap-2"&gt;</w:t>
+        <w:br/>
+        <w:t xml:space="preserve">              &lt;a href="https://leetcode.com/u/SanthoshPyaram/" target="_blank" rel="noopener noreferrer" class="btn btn-outline-warning fw-bold btn-sm"&gt;</w:t>
+        <w:br/>
+        <w:t xml:space="preserve">                &lt;i class="bi bi-box-arrow-up-right me-1"&gt;&lt;/i&gt; View LeetCode</w:t>
+        <w:br/>
+        <w:t xml:space="preserve">              &lt;/a&gt;</w:t>
+        <w:br/>
+        <w:t xml:space="preserve">              &lt;a href="https://github.com/SanthoshPyaram" target="_blank" rel="noopener noreferrer" class="btn btn-outline-primary fw-bold btn-sm"&gt;</w:t>
+        <w:br/>
+        <w:t xml:space="preserve">                &lt;i class="bi bi-github me-1"&gt;&lt;/i&gt; View GitHub</w:t>
+        <w:br/>
+        <w:t xml:space="preserve">              &lt;/a&gt;</w:t>
+        <w:br/>
+        <w:t xml:space="preserve">            &lt;/div&gt;</w:t>
+        <w:br/>
+        <w:t xml:space="preserve">          &lt;/div&gt;</w:t>
+        <w:br/>
+        <w:t xml:space="preserve">        &lt;/div&gt;</w:t>
+        <w:br/>
+        <w:br/>
+        <w:t xml:space="preserve">      &lt;/div&gt;</w:t>
+        <w:br/>
+        <w:t xml:space="preserve">    &lt;/section&gt;</w:t>
+        <w:br/>
+        <w:t xml:space="preserve">  `</w:t>
+        <w:br/>
+        <w:t>})</w:t>
+        <w:br/>
+        <w:t>export class AchievementsComponent {</w:t>
+        <w:br/>
+        <w:t xml:space="preserve">  portfolio = inject(PortfolioService);</w:t>
+        <w:br/>
+        <w:t>}</w:t>
+      </w:r>
+    </w:p>
+    <w:p>
+      <w:pPr>
+        <w:keepNext/>
+        <w:spacing w:before="280" w:after="120"/>
+      </w:pPr>
+      <w:r>
+        <w:rPr>
+          <w:rFonts w:ascii="Arial" w:hAnsi="Arial"/>
+          <w:b/>
+          <w:color w:val="0F172A"/>
+          <w:sz w:val="21"/>
+        </w:rPr>
+        <w:t>OUTPUT / SCREENSHOT — Achievements Section &amp; 100% Attendance Award Ceremony Photo</w:t>
+      </w:r>
+    </w:p>
+    <w:p>
+      <w:pPr>
+        <w:spacing w:before="80" w:after="80"/>
+        <w:jc w:val="center"/>
+      </w:pPr>
+      <w:r>
+        <w:drawing>
+          <wp:inline xmlns:a="http://schemas.openxmlformats.org/drawingml/2006/main" xmlns:pic="http://schemas.openxmlformats.org/drawingml/2006/picture">
+            <wp:extent cx="5669280" cy="2913865"/>
+            <wp:docPr id="5" name="Picture 5"/>
+            <wp:cNvGraphicFramePr>
+              <a:graphicFrameLocks noChangeAspect="1"/>
+            </wp:cNvGraphicFramePr>
+            <a:graphic>
+              <a:graphicData uri="http://schemas.openxmlformats.org/drawingml/2006/picture">
+                <pic:pic>
+                  <pic:nvPicPr>
+                    <pic:cNvPr id="0" name="5_achievements_section.png"/>
+                    <pic:cNvPicPr/>
+                  </pic:nvPicPr>
+                  <pic:blipFill>
+                    <a:blip r:embed="rId15"/>
+                    <a:stretch>
+                      <a:fillRect/>
+                    </a:stretch>
+                  </pic:blipFill>
+                  <pic:spPr>
+                    <a:xfrm>
+                      <a:off x="0" y="0"/>
+                      <a:ext cx="5669280" cy="2913865"/>
+                    </a:xfrm>
+                    <a:prstGeom prst="rect"/>
+                  </pic:spPr>
+                </pic:pic>
+              </a:graphicData>
+            </a:graphic>
+          </wp:inline>
+        </w:drawing>
+      </w:r>
+    </w:p>
+    <w:p>
+      <w:pPr>
+        <w:spacing w:before="0" w:after="200"/>
+        <w:jc w:val="center"/>
+      </w:pPr>
+      <w:r>
+        <w:rPr>
+          <w:rFonts w:ascii="Arial" w:hAnsi="Arial"/>
+          <w:i/>
+          <w:color w:val="64748B"/>
+          <w:sz w:val="17"/>
+        </w:rPr>
+        <w:t>Figure 5.1: Angular application Achievements section featuring 100% Attendance Award (Academic Year 2024–2025) with official VIT-AP University Day ceremony photograph, SIH, and certifications.</w:t>
+      </w:r>
+    </w:p>
+    <w:p>
+      <w:r>
+        <w:br w:type="page"/>
+      </w:r>
+    </w:p>
+    <w:p>
+      <w:pPr>
+        <w:keepNext/>
+        <w:spacing w:before="280" w:after="40"/>
+      </w:pPr>
+      <w:r>
+        <w:rPr>
+          <w:rFonts w:ascii="Arial" w:hAnsi="Arial"/>
+          <w:b/>
+          <w:color w:val="0F172A"/>
+          <w:sz w:val="26"/>
+        </w:rPr>
+        <w:t>6. Angular Contact Component &amp; Form Validation</w:t>
+      </w:r>
+    </w:p>
+    <w:p>
+      <w:pPr>
+        <w:keepNext/>
+        <w:spacing w:before="0" w:after="40"/>
+      </w:pPr>
+      <w:r>
+        <w:rPr>
+          <w:rFonts w:ascii="Consolas" w:hAnsi="Consolas"/>
+          <w:b/>
+          <w:color w:val="2563EB"/>
+          <w:sz w:val="20"/>
+        </w:rPr>
+        <w:t>src/app/components/contact/contact.component.ts</w:t>
+      </w:r>
+    </w:p>
+    <w:p>
+      <w:pPr>
+        <w:keepNext/>
+        <w:spacing w:before="0" w:after="80"/>
+      </w:pPr>
+      <w:r>
+        <w:rPr>
+          <w:rFonts w:ascii="Arial" w:hAnsi="Arial"/>
+          <w:b/>
+          <w:color w:val="475569"/>
+          <w:sz w:val="19"/>
+        </w:rPr>
+        <w:t>CODE</w:t>
+      </w:r>
+    </w:p>
+    <w:p>
+      <w:pPr>
+        <w:spacing w:before="0" w:after="0" w:line="252" w:lineRule="auto"/>
+      </w:pPr>
+      <w:r>
+        <w:rPr>
+          <w:rFonts w:ascii="Consolas" w:hAnsi="Consolas"/>
+          <w:color w:val="1E293B"/>
+          <w:sz w:val="16"/>
+        </w:rPr>
+        <w:t>import { Component, inject, signal } from '@angular/core';</w:t>
+        <w:br/>
+        <w:t>import { CommonModule } from '@angular/common';</w:t>
+        <w:br/>
+        <w:t>import { FormsModule } from '@angular/forms';</w:t>
+        <w:br/>
+        <w:t>import { PortfolioService } from '../../services/portfolio.service';</w:t>
+        <w:br/>
+        <w:br/>
+        <w:t>@Component({</w:t>
+        <w:br/>
+        <w:t xml:space="preserve">  selector: 'app-contact',</w:t>
+        <w:br/>
+        <w:t xml:space="preserve">  standalone: true,</w:t>
+        <w:br/>
+        <w:t xml:space="preserve">  imports: [CommonModule, FormsModule],</w:t>
+        <w:br/>
+        <w:t xml:space="preserve">  template: `</w:t>
+        <w:br/>
+        <w:t xml:space="preserve">    &lt;section id="contact" class="section-padding bg-black-subtle" aria-label="Contact Section"&gt;</w:t>
+        <w:br/>
+        <w:t xml:space="preserve">      &lt;div class="container"&gt;</w:t>
+        <w:br/>
+        <w:t xml:space="preserve">        &lt;!-- Section Header --&gt;</w:t>
+        <w:br/>
+        <w:t xml:space="preserve">        &lt;div class="section-header"&gt;</w:t>
+        <w:br/>
+        <w:t xml:space="preserve">          &lt;span class="section-badge"&gt;&lt;i class="bi bi-chat-dots-fill"&gt;&lt;/i&gt; Get in Touch&lt;/span&gt;</w:t>
+        <w:br/>
+        <w:t xml:space="preserve">          &lt;h2 class="section-title"&gt;Contact &lt;span class="gradient-text"&gt;Me&lt;/span&gt;&lt;/h2&gt;</w:t>
+        <w:br/>
+        <w:t xml:space="preserve">          &lt;p class="section-subtitle"&gt;</w:t>
+        <w:br/>
+        <w:t xml:space="preserve">            Have a question, an opportunity, or a collaborative engineering project? Let's connect!</w:t>
+        <w:br/>
+        <w:t xml:space="preserve">          &lt;/p&gt;</w:t>
+        <w:br/>
+        <w:t xml:space="preserve">        &lt;/div&gt;</w:t>
+        <w:br/>
+        <w:br/>
         <w:t xml:space="preserve">        &lt;div class="row g-4"&gt;</w:t>
         <w:br/>
-        <w:t xml:space="preserve">          &lt;!-- 3 Primary Technical Categories --&gt;</w:t>
-        <w:br/>
-        <w:t xml:space="preserve">          @for (cat of portfolio.skillCategories; track cat.title) {</w:t>
-        <w:br/>
-        <w:t xml:space="preserve">            &lt;div class="col-lg-4 col-md-6"&gt;</w:t>
-        <w:br/>
-        <w:t xml:space="preserve">              &lt;div class="glass-card skill-card"&gt;</w:t>
-        <w:br/>
-        <w:t xml:space="preserve">                &lt;div class="skill-category-header"&gt;</w:t>
-        <w:br/>
-        <w:t xml:space="preserve">                  &lt;div class="skill-cat-icon"&gt;</w:t>
-        <w:br/>
-        <w:t xml:space="preserve">                    &lt;i class="bi" [ngClass]="cat.icon"&gt;&lt;/i&gt;</w:t>
+        <w:t xml:space="preserve">          &lt;!-- Left Column: Contact Details &amp; Channels --&gt;</w:t>
+        <w:br/>
+        <w:t xml:space="preserve">          &lt;div class="col-lg-5"&gt;</w:t>
+        <w:br/>
+        <w:t xml:space="preserve">            &lt;div class="glass-card p-4 h-100 d-flex flex-column justify-content-between"&gt;</w:t>
+        <w:br/>
+        <w:t xml:space="preserve">              &lt;div&gt;</w:t>
+        <w:br/>
+        <w:t xml:space="preserve">                &lt;h3 class="h5 mb-3 text-white"&gt;Direct Communication Channels&lt;/h3&gt;</w:t>
+        <w:br/>
+        <w:t xml:space="preserve">                &lt;p class="text-secondary small mb-4"&gt;</w:t>
+        <w:br/>
+        <w:t xml:space="preserve">                  Feel free to reach out via phone, direct email, or connect with me on LinkedIn. I am actively available for technical discussions and internship roles.</w:t>
+        <w:br/>
+        <w:t xml:space="preserve">                &lt;/p&gt;</w:t>
+        <w:br/>
+        <w:br/>
+        <w:t xml:space="preserve">                &lt;div class="d-flex flex-column gap-3"&gt;</w:t>
+        <w:br/>
+        <w:t xml:space="preserve">                  &lt;!-- Phone --&gt;</w:t>
+        <w:br/>
+        <w:t xml:space="preserve">                  &lt;div class="d-flex align-items-center gap-3 p-3 rounded bg-black-subtle border border-secondary"&gt;</w:t>
+        <w:br/>
+        <w:t xml:space="preserve">                    &lt;div class="achievement-icon-box text-success" style="width: 44px; height: 44px; font-size: 1.25rem;"&gt;</w:t>
+        <w:br/>
+        <w:t xml:space="preserve">                      &lt;i class="bi bi-telephone-fill"&gt;&lt;/i&gt;</w:t>
+        <w:br/>
+        <w:t xml:space="preserve">                    &lt;/div&gt;</w:t>
+        <w:br/>
+        <w:t xml:space="preserve">                    &lt;div&gt;</w:t>
+        <w:br/>
+        <w:t xml:space="preserve">                      &lt;span class="text-muted small d-block"&gt;Phone Number&lt;/span&gt;</w:t>
+        <w:br/>
+        <w:t xml:space="preserve">                      &lt;a [href]="'tel:' + portfolio.phone" class="text-white fw-bold text-decoration-none"&gt;</w:t>
+        <w:br/>
+        <w:t xml:space="preserve">                        {{ portfolio.phone }}</w:t>
+        <w:br/>
+        <w:t xml:space="preserve">                      &lt;/a&gt;</w:t>
+        <w:br/>
+        <w:t xml:space="preserve">                    &lt;/div&gt;</w:t>
         <w:br/>
         <w:t xml:space="preserve">                  &lt;/div&gt;</w:t>
         <w:br/>
-        <w:t xml:space="preserve">                  &lt;div&gt;</w:t>
-        <w:br/>
-        <w:t xml:space="preserve">                    &lt;h3 class="h5 mb-0"&gt;{{ cat.title }}&lt;/h3&gt;</w:t>
-        <w:br/>
-        <w:t xml:space="preserve">                    &lt;span class="text-muted small"&gt;{{ cat.subtitle }}&lt;/span&gt;</w:t>
+        <w:br/>
+        <w:t xml:space="preserve">                  &lt;!-- Email --&gt;</w:t>
+        <w:br/>
+        <w:t xml:space="preserve">                  &lt;div class="d-flex align-items-center gap-3 p-3 rounded bg-black-subtle border border-secondary"&gt;</w:t>
+        <w:br/>
+        <w:t xml:space="preserve">                    &lt;div class="achievement-icon-box text-info" style="width: 44px; height: 44px; font-size: 1.25rem;"&gt;</w:t>
+        <w:br/>
+        <w:t xml:space="preserve">                      &lt;i class="bi bi-envelope-fill"&gt;&lt;/i&gt;</w:t>
+        <w:br/>
+        <w:t xml:space="preserve">                    &lt;/div&gt;</w:t>
+      </w:r>
+    </w:p>
+    <w:p>
+      <w:pPr>
+        <w:spacing w:before="0" w:after="0" w:line="252" w:lineRule="auto"/>
+      </w:pPr>
+      <w:r>
+        <w:rPr>
+          <w:rFonts w:ascii="Consolas" w:hAnsi="Consolas"/>
+          <w:color w:val="1E293B"/>
+          <w:sz w:val="16"/>
+        </w:rPr>
+        <w:t xml:space="preserve">                    &lt;div&gt;</w:t>
+        <w:br/>
+        <w:t xml:space="preserve">                      &lt;span class="text-muted small d-block"&gt;Email Address&lt;/span&gt;</w:t>
+        <w:br/>
+        <w:t xml:space="preserve">                      &lt;a [href]="'mailto:' + portfolio.email" class="text-white fw-bold text-decoration-none"&gt;</w:t>
+        <w:br/>
+        <w:t xml:space="preserve">                        {{ portfolio.email }}</w:t>
+        <w:br/>
+        <w:t xml:space="preserve">                      &lt;/a&gt;</w:t>
+        <w:br/>
+        <w:t xml:space="preserve">                    &lt;/div&gt;</w:t>
         <w:br/>
         <w:t xml:space="preserve">                  &lt;/div&gt;</w:t>
         <w:br/>
+        <w:br/>
+        <w:t xml:space="preserve">                  &lt;!-- LinkedIn --&gt;</w:t>
+        <w:br/>
+        <w:t xml:space="preserve">                  &lt;div class="d-flex align-items-center gap-3 p-3 rounded bg-black-subtle border border-secondary"&gt;</w:t>
+        <w:br/>
+        <w:t xml:space="preserve">                    &lt;div class="achievement-icon-box text-primary" style="width: 44px; height: 44px; font-size: 1.25rem;"&gt;</w:t>
+        <w:br/>
+        <w:t xml:space="preserve">                      &lt;i class="bi bi-linkedin"&gt;&lt;/i&gt;</w:t>
+        <w:br/>
+        <w:t xml:space="preserve">                    &lt;/div&gt;</w:t>
+        <w:br/>
+        <w:t xml:space="preserve">                    &lt;div&gt;</w:t>
+        <w:br/>
+        <w:t xml:space="preserve">                      &lt;span class="text-muted small d-block"&gt;LinkedIn Profile&lt;/span&gt;</w:t>
+        <w:br/>
+        <w:t xml:space="preserve">                      &lt;a href="https://www.linkedin.com/in/pyaram-santhosh" target="_blank" rel="noopener noreferrer" class="text-white fw-bold text-decoration-none"&gt;</w:t>
+        <w:br/>
+        <w:t xml:space="preserve">                        linkedin.com/in/pyaram-santhosh</w:t>
+        <w:br/>
+        <w:t xml:space="preserve">                      &lt;/a&gt;</w:t>
+        <w:br/>
+        <w:t xml:space="preserve">                    &lt;/div&gt;</w:t>
+        <w:br/>
+        <w:t xml:space="preserve">                  &lt;/div&gt;</w:t>
+        <w:br/>
+        <w:br/>
+        <w:t xml:space="preserve">                  &lt;!-- Location --&gt;</w:t>
+        <w:br/>
+        <w:t xml:space="preserve">                  &lt;div class="d-flex align-items-center gap-3 p-3 rounded bg-black-subtle border border-secondary"&gt;</w:t>
+        <w:br/>
+        <w:t xml:space="preserve">                    &lt;div class="achievement-icon-box text-danger" style="width: 44px; height: 44px; font-size: 1.25rem;"&gt;</w:t>
+        <w:br/>
+        <w:t xml:space="preserve">                      &lt;i class="bi bi-geo-alt-fill"&gt;&lt;/i&gt;</w:t>
+        <w:br/>
+        <w:t xml:space="preserve">                    &lt;/div&gt;</w:t>
+        <w:br/>
+        <w:t xml:space="preserve">                    &lt;div&gt;</w:t>
+        <w:br/>
+        <w:t xml:space="preserve">                      &lt;span class="text-muted small d-block"&gt;Current Location&lt;/span&gt;</w:t>
+        <w:br/>
+        <w:t xml:space="preserve">                      &lt;span class="text-white small fw-bold"&gt;{{ portfolio.location }}&lt;/span&gt;</w:t>
+        <w:br/>
+        <w:t xml:space="preserve">                    &lt;/div&gt;</w:t>
+        <w:br/>
+        <w:t xml:space="preserve">                  &lt;/div&gt;</w:t>
+        <w:br/>
         <w:t xml:space="preserve">                &lt;/div&gt;</w:t>
         <w:br/>
-        <w:br/>
-        <w:t xml:space="preserve">                @for (item of cat.items; track item.name) {</w:t>
-        <w:br/>
-        <w:t xml:space="preserve">                  &lt;div class="skill-item"&gt;</w:t>
-        <w:br/>
-        <w:t xml:space="preserve">                    &lt;div class="skill-item-header"&gt;</w:t>
-        <w:br/>
-        <w:t xml:space="preserve">                      &lt;span class="skill-name"&gt;</w:t>
-        <w:br/>
-        <w:t xml:space="preserve">                        &lt;i class="bi" [ngClass]="[item.icon, item.iconColor]"&gt;&lt;/i&gt; {{ item.name }}</w:t>
-        <w:br/>
-        <w:t xml:space="preserve">                      &lt;/span&gt;</w:t>
-        <w:br/>
-        <w:t xml:space="preserve">                      &lt;span class="skill-status-tag" [ngClass]="item.statusClass"&gt;{{ item.status }}&lt;/span&gt;</w:t>
-        <w:br/>
-        <w:t xml:space="preserve">                    &lt;/div&gt;</w:t>
-        <w:br/>
-        <w:t xml:space="preserve">                    &lt;div class="custom-progress"&gt;</w:t>
-        <w:br/>
-        <w:t xml:space="preserve">                      &lt;div class="progress-bar" [ngClass]="item.progressBarClass || ''" [style.width.%]="item.percentage"&gt;&lt;/div&gt;</w:t>
-        <w:br/>
-        <w:t xml:space="preserve">                    &lt;/div&gt;</w:t>
-        <w:br/>
-        <w:t xml:space="preserve">                  &lt;/div&gt;</w:t>
-        <w:br/>
-        <w:t xml:space="preserve">                }</w:t>
+        <w:t xml:space="preserve">              &lt;/div&gt;</w:t>
+        <w:br/>
+        <w:br/>
+        <w:t xml:space="preserve">              &lt;!-- Social Links Footer --&gt;</w:t>
+        <w:br/>
+        <w:t xml:space="preserve">              &lt;div class="mt-4 pt-3 border-top border-secondary"&gt;</w:t>
+        <w:br/>
+        <w:t xml:space="preserve">                &lt;span class="text-muted small d-block mb-2"&gt;Connect Across Platforms:&lt;/span&gt;</w:t>
+        <w:br/>
+        <w:t xml:space="preserve">                &lt;div class="d-flex gap-2"&gt;</w:t>
+        <w:br/>
+        <w:t xml:space="preserve">                  @for (p of portfolio.socialProfiles; track p.platform) {</w:t>
+        <w:br/>
+        <w:t xml:space="preserve">                    &lt;a [href]="p.url" </w:t>
+        <w:br/>
+        <w:t xml:space="preserve">                       target="_blank" </w:t>
+        <w:br/>
+        <w:t xml:space="preserve">                       rel="noopener noreferrer" </w:t>
+        <w:br/>
+        <w:t xml:space="preserve">                       class="social-link-btn" </w:t>
+        <w:br/>
+        <w:t xml:space="preserve">                       [title]="p.title"&gt;</w:t>
+        <w:br/>
+        <w:t xml:space="preserve">                      &lt;i class="bi" [ngClass]="[p.icon, p.colorClass]"&gt;&lt;/i&gt;</w:t>
+        <w:br/>
+        <w:t xml:space="preserve">                    &lt;/a&gt;</w:t>
+        <w:br/>
+        <w:t xml:space="preserve">                  }</w:t>
+        <w:br/>
+        <w:t xml:space="preserve">                &lt;/div&gt;</w:t>
         <w:br/>
         <w:t xml:space="preserve">              &lt;/div&gt;</w:t>
         <w:br/>
@@ -1999,102 +2693,100 @@
           <w:color w:val="1E293B"/>
           <w:sz w:val="16"/>
         </w:rPr>
-        <w:t xml:space="preserve">          }</w:t>
-        <w:br/>
-        <w:br/>
-        <w:t xml:space="preserve">          &lt;!-- 4. Embedded Systems &amp; IoT (ECS) Section --&gt;</w:t>
-        <w:br/>
-        <w:t xml:space="preserve">          &lt;div class="col-12"&gt;</w:t>
+        <w:t xml:space="preserve">          &lt;/div&gt;</w:t>
+        <w:br/>
+        <w:br/>
+        <w:t xml:space="preserve">          &lt;!-- Right Column: Interactive TypeScript Form --&gt;</w:t>
+        <w:br/>
+        <w:t xml:space="preserve">          &lt;div class="col-lg-7"&gt;</w:t>
         <w:br/>
         <w:t xml:space="preserve">            &lt;div class="glass-card p-4"&gt;</w:t>
         <w:br/>
-        <w:t xml:space="preserve">              &lt;div class="skill-category-header mb-3"&gt;</w:t>
-        <w:br/>
-        <w:t xml:space="preserve">                &lt;div class="skill-cat-icon"&gt;</w:t>
-        <w:br/>
-        <w:t xml:space="preserve">                  &lt;i class="bi bi-cpu-fill"&gt;&lt;/i&gt;</w:t>
+        <w:t xml:space="preserve">              &lt;h3 class="h5 mb-3 text-white"&gt;Send a Direct Message&lt;/h3&gt;</w:t>
+        <w:br/>
+        <w:br/>
+        <w:t xml:space="preserve">              @if (submitSuccess()) {</w:t>
+        <w:br/>
+        <w:t xml:space="preserve">                &lt;div class="alert alert-success d-flex align-items-center gap-2 mb-4" role="alert"&gt;</w:t>
+        <w:br/>
+        <w:t xml:space="preserve">                  &lt;i class="bi bi-check-circle-fill fs-5"&gt;&lt;/i&gt;</w:t>
+        <w:br/>
+        <w:t xml:space="preserve">                  &lt;div&gt;</w:t>
+        <w:br/>
+        <w:t xml:space="preserve">                    &lt;strong&gt;Thank you!&lt;/strong&gt; Your message has been received successfully. I will get back to you promptly.</w:t>
+        <w:br/>
+        <w:t xml:space="preserve">                  &lt;/div&gt;</w:t>
         <w:br/>
         <w:t xml:space="preserve">                &lt;/div&gt;</w:t>
         <w:br/>
-        <w:t xml:space="preserve">                &lt;div&gt;</w:t>
-        <w:br/>
-        <w:t xml:space="preserve">                  &lt;h3 class="h5 mb-0"&gt;Embedded Systems &amp;amp; IoT (ECS)&lt;/h3&gt;</w:t>
-        <w:br/>
-        <w:t xml:space="preserve">                  &lt;span class="text-muted small"&gt;Hardware-Software Integration &amp;amp; Sensor Systems&lt;/span&gt;</w:t>
-        <w:br/>
-        <w:t xml:space="preserve">                &lt;/div&gt;</w:t>
-        <w:br/>
-        <w:t xml:space="preserve">              &lt;/div&gt;</w:t>
-        <w:br/>
-        <w:t xml:space="preserve">              &lt;div class="row g-3"&gt;</w:t>
-        <w:br/>
-        <w:t xml:space="preserve">                @for (skill of portfolio.ecsSkills; track skill.name) {</w:t>
-        <w:br/>
-        <w:t xml:space="preserve">                  &lt;div class="col-md-4 col-sm-6"&gt;</w:t>
-        <w:br/>
-        <w:t xml:space="preserve">                    &lt;div class="skill-item mb-0"&gt;</w:t>
-        <w:br/>
-        <w:t xml:space="preserve">                      &lt;div class="skill-item-header"&gt;</w:t>
-        <w:br/>
-        <w:t xml:space="preserve">                        &lt;span class="skill-name"&gt;</w:t>
-        <w:br/>
-        <w:t xml:space="preserve">                          &lt;i class="bi" [ngClass]="[skill.icon, skill.iconColor]"&gt;&lt;/i&gt; {{ skill.name }}</w:t>
-        <w:br/>
-        <w:t xml:space="preserve">                        &lt;/span&gt;</w:t>
-        <w:br/>
-        <w:t xml:space="preserve">                        &lt;span class="skill-status-tag" [ngClass]="skill.statusClass"&gt;{{ skill.status }}&lt;/span&gt;</w:t>
-        <w:br/>
-        <w:t xml:space="preserve">                      &lt;/div&gt;</w:t>
-        <w:br/>
-        <w:t xml:space="preserve">                      &lt;div class="custom-progress"&gt;</w:t>
-        <w:br/>
-        <w:t xml:space="preserve">                        &lt;div class="progress-bar" [ngClass]="skill.progressBarClass || ''" [style.width.%]="skill.percentage"&gt;&lt;/div&gt;</w:t>
-        <w:br/>
-        <w:t xml:space="preserve">                      &lt;/div&gt;</w:t>
-        <w:br/>
-        <w:t xml:space="preserve">                    &lt;/div&gt;</w:t>
+        <w:t xml:space="preserve">              }</w:t>
+        <w:br/>
+        <w:br/>
+        <w:t xml:space="preserve">              &lt;form (ngSubmit)="onSubmit()" #contactForm="ngForm"&gt;</w:t>
+        <w:br/>
+        <w:t xml:space="preserve">                &lt;div class="row g-3"&gt;</w:t>
+        <w:br/>
+        <w:t xml:space="preserve">                  &lt;div class="col-md-6"&gt;</w:t>
+        <w:br/>
+        <w:t xml:space="preserve">                    &lt;label for="senderName" class="form-label text-muted small"&gt;Your Name *&lt;/label&gt;</w:t>
+        <w:br/>
+        <w:t xml:space="preserve">                    &lt;input </w:t>
+        <w:br/>
+        <w:t xml:space="preserve">                      type="text" </w:t>
+        <w:br/>
+        <w:t xml:space="preserve">                      class="form-control bg-black-subtle text-white border-secondary" </w:t>
+        <w:br/>
+        <w:t xml:space="preserve">                      id="senderName" </w:t>
+        <w:br/>
+        <w:t xml:space="preserve">                      name="senderName" </w:t>
+        <w:br/>
+        <w:t xml:space="preserve">                      [(ngModel)]="formData.name" </w:t>
+        <w:br/>
+        <w:t xml:space="preserve">                      required </w:t>
+        <w:br/>
+        <w:t xml:space="preserve">                      placeholder="e.g. Alex Johnson"&gt;</w:t>
         <w:br/>
         <w:t xml:space="preserve">                  &lt;/div&gt;</w:t>
         <w:br/>
-        <w:t xml:space="preserve">                }</w:t>
-        <w:br/>
-        <w:t xml:space="preserve">              &lt;/div&gt;</w:t>
-        <w:br/>
-        <w:t xml:space="preserve">            &lt;/div&gt;</w:t>
-        <w:br/>
-        <w:t xml:space="preserve">          &lt;/div&gt;</w:t>
-        <w:br/>
-        <w:br/>
-        <w:t xml:space="preserve">          &lt;!-- 5. Soft Skills Highlight Section --&gt;</w:t>
-        <w:br/>
-        <w:t xml:space="preserve">          &lt;div class="col-12"&gt;</w:t>
-        <w:br/>
-        <w:t xml:space="preserve">            &lt;div class="glass-card p-4"&gt;</w:t>
-        <w:br/>
-        <w:t xml:space="preserve">              &lt;h3 class="h5 mb-3 d-flex align-items-center gap-2"&gt;</w:t>
-        <w:br/>
-        <w:t xml:space="preserve">                &lt;i class="bi bi-people-fill text-info"&gt;&lt;/i&gt; Key Soft Skills &amp;amp; Professional Attributes</w:t>
-        <w:br/>
-        <w:t xml:space="preserve">              &lt;/h3&gt;</w:t>
-        <w:br/>
-        <w:t xml:space="preserve">              &lt;div class="d-flex flex-wrap gap-3"&gt;</w:t>
-        <w:br/>
-        <w:t xml:space="preserve">                @for (soft of portfolio.softSkills; track soft.name) {</w:t>
-        <w:br/>
-        <w:t xml:space="preserve">                  &lt;div class="soft-skill-chip"&gt;</w:t>
-        <w:br/>
-        <w:t xml:space="preserve">                    &lt;i class="bi" [ngClass]="[soft.icon, soft.colorClass]"&gt;&lt;/i&gt; {{ soft.name }}</w:t>
+        <w:br/>
+        <w:t xml:space="preserve">                  &lt;div class="col-md-6"&gt;</w:t>
+        <w:br/>
+        <w:t xml:space="preserve">                    &lt;label for="senderEmail" class="form-label text-muted small"&gt;Email Address *&lt;/label&gt;</w:t>
+        <w:br/>
+        <w:t xml:space="preserve">                    &lt;input </w:t>
+        <w:br/>
+        <w:t xml:space="preserve">                      type="email" </w:t>
+        <w:br/>
+        <w:t xml:space="preserve">                      class="form-control bg-black-subtle text-white border-secondary" </w:t>
+        <w:br/>
+        <w:t xml:space="preserve">                      id="senderEmail" </w:t>
+        <w:br/>
+        <w:t xml:space="preserve">                      name="senderEmail" </w:t>
+        <w:br/>
+        <w:t xml:space="preserve">                      [(ngModel)]="formData.email" </w:t>
+        <w:br/>
+        <w:t xml:space="preserve">                      required </w:t>
+        <w:br/>
+        <w:t xml:space="preserve">                      placeholder="e.g. alex@example.com"&gt;</w:t>
         <w:br/>
         <w:t xml:space="preserve">                  &lt;/div&gt;</w:t>
         <w:br/>
-        <w:t xml:space="preserve">                }</w:t>
-        <w:br/>
-        <w:t xml:space="preserve">              &lt;/div&gt;</w:t>
-        <w:br/>
-        <w:t xml:space="preserve">            &lt;/div&gt;</w:t>
-        <w:br/>
-        <w:t xml:space="preserve">          &lt;/div&gt;</w:t>
-        <w:br/>
+        <w:br/>
+        <w:t xml:space="preserve">                  &lt;div class="col-12"&gt;</w:t>
+        <w:br/>
+        <w:t xml:space="preserve">                    &lt;label for="subject" class="form-label text-muted small"&gt;Subject&lt;/label&gt;</w:t>
+        <w:br/>
+        <w:t xml:space="preserve">                    &lt;input </w:t>
+        <w:br/>
+        <w:t xml:space="preserve">                      type="text" </w:t>
+        <w:br/>
+        <w:t xml:space="preserve">                      class="form-control bg-black-subtle text-white border-secondary" </w:t>
+        <w:br/>
+        <w:t xml:space="preserve">                      id="subject" </w:t>
+        <w:br/>
+        <w:t xml:space="preserve">                      name="subject" </w:t>
+        <w:br/>
+        <w:t xml:space="preserve">                      [(ngModel)]="formData.subject" </w:t>
       </w:r>
     </w:p>
     <w:p>
@@ -2107,6 +2799,70 @@
           <w:color w:val="1E293B"/>
           <w:sz w:val="16"/>
         </w:rPr>
+        <w:t xml:space="preserve">                      placeholder="Project Inquiry / Opportunity"&gt;</w:t>
+        <w:br/>
+        <w:t xml:space="preserve">                  &lt;/div&gt;</w:t>
+        <w:br/>
+        <w:br/>
+        <w:t xml:space="preserve">                  &lt;div class="col-12"&gt;</w:t>
+        <w:br/>
+        <w:t xml:space="preserve">                    &lt;label for="message" class="form-label text-muted small"&gt;Message *&lt;/label&gt;</w:t>
+        <w:br/>
+        <w:t xml:space="preserve">                    &lt;textarea </w:t>
+        <w:br/>
+        <w:t xml:space="preserve">                      class="form-control bg-black-subtle text-white border-secondary" </w:t>
+        <w:br/>
+        <w:t xml:space="preserve">                      id="message" </w:t>
+        <w:br/>
+        <w:t xml:space="preserve">                      name="message" </w:t>
+        <w:br/>
+        <w:t xml:space="preserve">                      rows="5" </w:t>
+        <w:br/>
+        <w:t xml:space="preserve">                      [(ngModel)]="formData.message" </w:t>
+        <w:br/>
+        <w:t xml:space="preserve">                      required </w:t>
+        <w:br/>
+        <w:t xml:space="preserve">                      placeholder="Share your requirements or thoughts here..."&gt;&lt;/textarea&gt;</w:t>
+        <w:br/>
+        <w:t xml:space="preserve">                  &lt;/div&gt;</w:t>
+        <w:br/>
+        <w:br/>
+        <w:t xml:space="preserve">                  &lt;div class="col-12"&gt;</w:t>
+        <w:br/>
+        <w:t xml:space="preserve">                    &lt;button </w:t>
+        <w:br/>
+        <w:t xml:space="preserve">                      type="submit" </w:t>
+        <w:br/>
+        <w:t xml:space="preserve">                      class="btn-primary-gradient w-100 py-3 d-flex align-items-center justify-content-center gap-2"</w:t>
+        <w:br/>
+        <w:t xml:space="preserve">                      [disabled]="!contactForm.form.valid || isSubmitting()"&gt;</w:t>
+        <w:br/>
+        <w:t xml:space="preserve">                      @if (isSubmitting()) {</w:t>
+        <w:br/>
+        <w:t xml:space="preserve">                        &lt;span class="spinner-border spinner-border-sm" role="status" aria-hidden="true"&gt;&lt;/span&gt;</w:t>
+        <w:br/>
+        <w:t xml:space="preserve">                        &lt;span&gt;Sending Message...&lt;/span&gt;</w:t>
+        <w:br/>
+        <w:t xml:space="preserve">                      } @else {</w:t>
+        <w:br/>
+        <w:t xml:space="preserve">                        &lt;i class="bi bi-send-fill"&gt;&lt;/i&gt;</w:t>
+        <w:br/>
+        <w:t xml:space="preserve">                        &lt;span&gt;Send Message&lt;/span&gt;</w:t>
+        <w:br/>
+        <w:t xml:space="preserve">                      }</w:t>
+        <w:br/>
+        <w:t xml:space="preserve">                    &lt;/button&gt;</w:t>
+        <w:br/>
+        <w:t xml:space="preserve">                  &lt;/div&gt;</w:t>
+        <w:br/>
+        <w:t xml:space="preserve">                &lt;/div&gt;</w:t>
+        <w:br/>
+        <w:t xml:space="preserve">              &lt;/form&gt;</w:t>
+        <w:br/>
+        <w:t xml:space="preserve">            &lt;/div&gt;</w:t>
+        <w:br/>
+        <w:t xml:space="preserve">          &lt;/div&gt;</w:t>
+        <w:br/>
         <w:t xml:space="preserve">        &lt;/div&gt;</w:t>
         <w:br/>
         <w:t xml:space="preserve">      &lt;/div&gt;</w:t>
@@ -2117,9 +2873,62 @@
         <w:br/>
         <w:t>})</w:t>
         <w:br/>
-        <w:t>export class SkillsComponent {</w:t>
+        <w:t>export class ContactComponent {</w:t>
         <w:br/>
         <w:t xml:space="preserve">  portfolio = inject(PortfolioService);</w:t>
+        <w:br/>
+        <w:br/>
+        <w:t xml:space="preserve">  formData = {</w:t>
+        <w:br/>
+        <w:t xml:space="preserve">    name: '',</w:t>
+        <w:br/>
+        <w:t xml:space="preserve">    email: '',</w:t>
+        <w:br/>
+        <w:t xml:space="preserve">    subject: '',</w:t>
+        <w:br/>
+        <w:t xml:space="preserve">    message: ''</w:t>
+        <w:br/>
+        <w:t xml:space="preserve">  };</w:t>
+        <w:br/>
+        <w:br/>
+        <w:t xml:space="preserve">  isSubmitting = signal&lt;boolean&gt;(false);</w:t>
+        <w:br/>
+        <w:t xml:space="preserve">  submitSuccess = signal&lt;boolean&gt;(false);</w:t>
+      </w:r>
+    </w:p>
+    <w:p>
+      <w:pPr>
+        <w:spacing w:before="0" w:after="0" w:line="252" w:lineRule="auto"/>
+      </w:pPr>
+      <w:r>
+        <w:rPr>
+          <w:rFonts w:ascii="Consolas" w:hAnsi="Consolas"/>
+          <w:color w:val="1E293B"/>
+          <w:sz w:val="16"/>
+        </w:rPr>
+        <w:br/>
+        <w:t xml:space="preserve">  onSubmit(): void {</w:t>
+        <w:br/>
+        <w:t xml:space="preserve">    if (!this.formData.name || !this.formData.email || !this.formData.message) return;</w:t>
+        <w:br/>
+        <w:br/>
+        <w:t xml:space="preserve">    this.isSubmitting.set(true);</w:t>
+        <w:br/>
+        <w:t xml:space="preserve">    // Simulate async submission</w:t>
+        <w:br/>
+        <w:t xml:space="preserve">    setTimeout(() =&gt; {</w:t>
+        <w:br/>
+        <w:t xml:space="preserve">      this.isSubmitting.set(false);</w:t>
+        <w:br/>
+        <w:t xml:space="preserve">      this.submitSuccess.set(true);</w:t>
+        <w:br/>
+        <w:t xml:space="preserve">      this.formData = { name: '', email: '', subject: '', message: '' };</w:t>
+        <w:br/>
+        <w:t xml:space="preserve">      setTimeout(() =&gt; this.submitSuccess.set(false), 6000);</w:t>
+        <w:br/>
+        <w:t xml:space="preserve">    }, 800);</w:t>
+        <w:br/>
+        <w:t xml:space="preserve">  }</w:t>
         <w:br/>
         <w:t>}</w:t>
         <w:br/>
@@ -2148,8 +2957,8 @@
       <w:r>
         <w:drawing>
           <wp:inline xmlns:a="http://schemas.openxmlformats.org/drawingml/2006/main" xmlns:pic="http://schemas.openxmlformats.org/drawingml/2006/picture">
-            <wp:extent cx="5669280" cy="2908494"/>
-            <wp:docPr id="5" name="Picture 5"/>
+            <wp:extent cx="5669280" cy="2913865"/>
+            <wp:docPr id="6" name="Picture 6"/>
             <wp:cNvGraphicFramePr>
               <a:graphicFrameLocks noChangeAspect="1"/>
             </wp:cNvGraphicFramePr>
@@ -2157,11 +2966,11 @@
               <a:graphicData uri="http://schemas.openxmlformats.org/drawingml/2006/picture">
                 <pic:pic>
                   <pic:nvPicPr>
-                    <pic:cNvPr id="0" name="5_contact_section.png"/>
+                    <pic:cNvPr id="0" name="6_contact_section.png"/>
                     <pic:cNvPicPr/>
                   </pic:nvPicPr>
                   <pic:blipFill>
-                    <a:blip r:embed="rId15"/>
+                    <a:blip r:embed="rId16"/>
                     <a:stretch>
                       <a:fillRect/>
                     </a:stretch>
@@ -2169,7 +2978,7 @@
                   <pic:spPr>
                     <a:xfrm>
                       <a:off x="0" y="0"/>
-                      <a:ext cx="5669280" cy="2908494"/>
+                      <a:ext cx="5669280" cy="2913865"/>
                     </a:xfrm>
                     <a:prstGeom prst="rect"/>
                   </pic:spPr>
@@ -2192,7 +3001,7 @@
           <w:color w:val="64748B"/>
           <w:sz w:val="17"/>
         </w:rPr>
-        <w:t>Figure 5.1: Angular application Contact section featuring interactive message form with real-time field validation, contact channels, and social media connectivity.</w:t>
+        <w:t>Figure 6.1: Angular application Contact section featuring interactive message form with real-time field validation, contact channels, and social media connectivity.</w:t>
       </w:r>
     </w:p>
     <w:p>
@@ -2212,7 +3021,7 @@
           <w:color w:val="0F172A"/>
           <w:sz w:val="26"/>
         </w:rPr>
-        <w:t>6. Angular Resume Modal Component with Print Handler</w:t>
+        <w:t>7. Angular Resume Modal Component with Print Handler</w:t>
       </w:r>
     </w:p>
     <w:p>
@@ -2827,7 +3636,7 @@
         <w:drawing>
           <wp:inline xmlns:a="http://schemas.openxmlformats.org/drawingml/2006/main" xmlns:pic="http://schemas.openxmlformats.org/drawingml/2006/picture">
             <wp:extent cx="5669280" cy="3254935"/>
-            <wp:docPr id="6" name="Picture 6"/>
+            <wp:docPr id="7" name="Picture 7"/>
             <wp:cNvGraphicFramePr>
               <a:graphicFrameLocks noChangeAspect="1"/>
             </wp:cNvGraphicFramePr>
@@ -2835,11 +3644,11 @@
               <a:graphicData uri="http://schemas.openxmlformats.org/drawingml/2006/picture">
                 <pic:pic>
                   <pic:nvPicPr>
-                    <pic:cNvPr id="0" name="6_resume_modal.png"/>
+                    <pic:cNvPr id="0" name="7_resume_modal.png"/>
                     <pic:cNvPicPr/>
                   </pic:nvPicPr>
                   <pic:blipFill>
-                    <a:blip r:embed="rId16"/>
+                    <a:blip r:embed="rId17"/>
                     <a:stretch>
                       <a:fillRect/>
                     </a:stretch>
@@ -2870,7 +3679,7 @@
           <w:color w:val="64748B"/>
           <w:sz w:val="17"/>
         </w:rPr>
-        <w:t>Figure 6.1: Angular application Resume modal rendered dynamically with print-to-PDF formatting, exact 9.68 CGPA, and all 4 projects.</w:t>
+        <w:t>Figure 7.1: Angular application Resume modal rendered dynamically with print-to-PDF formatting, exact 9.68 CGPA, 100% Attendance Award, and all 4 projects.</w:t>
       </w:r>
     </w:p>
     <w:p>
@@ -2890,7 +3699,7 @@
           <w:color w:val="0F172A"/>
           <w:sz w:val="26"/>
         </w:rPr>
-        <w:t>7. Global Styles, Design Tokens &amp; Glassmorphism System</w:t>
+        <w:t>8. Global Styles, Design Tokens &amp; Glassmorphism System</w:t>
       </w:r>
     </w:p>
     <w:p>

</xml_diff>